<commit_message>
QA + fix round: CZ language fixes, re-rendered brochures, enlarged QRs, site visual fixes (mobile table, ink section drawing, sticky CTA), OG/canonical metadata, reconciled copy docs, visual cohesion report, final spec with decisions
</commit_message>
<xml_diff>
--- a/deliverables/email-docx/Email CZ tykani.docx
+++ b/deliverables/email-docx/Email CZ tykani.docx
@@ -216,7 +216,7 @@
           <w:i/>
           <w:sz w:val="22"/>
         </w:rPr>
-        <w:t>Máme povolení stavět. 14 milionů korun už upsali naši členové. Tady je, kde stojíme.</w:t>
+        <w:t>Máme povolení stavět. 14 milionů korun už upsali naši členové. A tady je, co ještě chybí.</w:t>
       </w:r>
     </w:p>
     <w:p>
@@ -262,7 +262,7 @@
           <w:i w:val="0"/>
           <w:sz w:val="22"/>
         </w:rPr>
-        <w:t>doufám, že se Ti daří dobře, a děkuju za přátelství, které našemu sboru už roky prokazuješ.</w:t>
+        <w:t>doufám, že se Ti daří dobře, a děkuji za přátelství, které našemu sboru už roky prokazuješ.</w:t>
       </w:r>
     </w:p>
     <w:p>
@@ -284,7 +284,7 @@
           <w:i w:val="0"/>
           <w:sz w:val="22"/>
         </w:rPr>
-        <w:t>Náš sbor se už třicet let schází k nedělním bohoslužbám v pronajatém hotelovém sále dva kilometry odsud. Vlastní budovu přitom máme plnou celý týden — dorost a mládež, skupinky, poradenství — a každou neděli ráno v ní nikdo z nás není. Nová modlitebna dá všechno pod jednu střechu, ve čtvrti se 109 000 obyvateli a 38 000 vysokoškoláky, z nichž mnozí nikdy nebyli v evangelickém kostele.</w:t>
+        <w:t>Náš sbor se už třicet let schází k nedělním bohoslužbám v pronajatém hotelovém sále dva kilometry od naší budovy. Vlastní budovu přitom máme plnou celý týden — dorost a mládež, skupinky, poradenství — a každou neděli ráno v ní nikdo z nás není. Nová modlitebna spojí všechno pod jednou střechou, ve čtvrti se 109 000 obyvateli a 38 000 vysokoškoláky, z nichž mnozí nikdy nebyli v evangelickém kostele.</w:t>
       </w:r>
     </w:p>
     <w:p>
@@ -295,7 +295,7 @@
           <w:i w:val="0"/>
           <w:sz w:val="22"/>
         </w:rPr>
-        <w:t>Kvůli pražským stavebním předpisům musí být modlitebna postavená převážně pod zemí. Proto stojí tolik, kolik stojí.</w:t>
+        <w:t>Kvůli pražským stavebním předpisům musí být modlitebna postavena převážně pod zemí. Proto stojí tolik, kolik stojí.</w:t>
       </w:r>
     </w:p>
     <w:p>
@@ -306,7 +306,7 @@
           <w:i w:val="0"/>
           <w:sz w:val="22"/>
         </w:rPr>
-        <w:t>Kde stojíme:</w:t>
+        <w:t>Jak jsme na tom:</w:t>
       </w:r>
     </w:p>
     <w:p>
@@ -321,7 +321,7 @@
           <w:i w:val="0"/>
           <w:sz w:val="22"/>
         </w:rPr>
-        <w:t>Náklady projektu: 54 000 000 Kč</w:t>
+        <w:t>Náklady projektu: 54 000 000 Kč</w:t>
       </w:r>
     </w:p>
     <w:p>
@@ -336,7 +336,7 @@
           <w:i w:val="0"/>
           <w:sz w:val="22"/>
         </w:rPr>
-        <w:t>Upsáno našimi členy: 14 000 000 Kč</w:t>
+        <w:t>Upsáno našimi členy: 14 000 000 Kč</w:t>
       </w:r>
     </w:p>
     <w:p>
@@ -351,7 +351,7 @@
           <w:i w:val="0"/>
           <w:sz w:val="22"/>
         </w:rPr>
-        <w:t>Ještě chybí: 40 000 000 Kč</w:t>
+        <w:t>Ještě chybí: 40 000 000 Kč</w:t>
       </w:r>
     </w:p>
     <w:p>
@@ -373,7 +373,7 @@
           <w:i w:val="0"/>
           <w:sz w:val="22"/>
         </w:rPr>
-        <w:t>Přikládám jednostránkové shrnutí. Rád bych Tě poprosil, jestli bys zvážil dar.</w:t>
+        <w:t>Přikládám jednostránkové shrnutí. Rád bych Tě poprosil, abys zvážil dar.</w:t>
       </w:r>
     </w:p>
     <w:p>
@@ -454,7 +454,7 @@
           <w:i w:val="0"/>
           <w:sz w:val="22"/>
         </w:rPr>
-        <w:t xml:space="preserve">P.S. Na dar rádi vystavíme potvrzení pro daňové účely — stačí napsat na hospodar@cb6.cz. Všechno ostatní najdeš tady: </w:t>
+        <w:t xml:space="preserve">P.S. Na dar rádi vystavíme potvrzení o daru pro daňové účely — stačí napsat na hospodar@cb6.cz. Všechno ostatní najdeš tady: </w:t>
       </w:r>
       <w:hyperlink r:id="rId9">
         <w:r>

</xml_diff>